<commit_message>
Add Inspection Schedule step for PS1's Schedule of Inspections table
- New wizard step: pick which of 7 typical inspection items apply, add
  an optional free-text "Other" item, and order them via Move Up/Move
  Down - that order becomes the No. column and physical row order in
  PS1's Schedule of Inspections table.
- PS1 template: added the 5 previously-missing inspection items plus an
  Other row (only 2 of 7 existed before), each row's No. cell now a
  per-item token instead of hardcoded text.
- word_filler.py: _remove_unselected_table_rows gained a label_column
  parameter (for tables whose first column isn't stable match text), and
  a new _reorder_table_rows physically moves surviving rows into the
  user's chosen order - assigning the right number isn't enough on its
  own if the row itself doesn't move.

Co-Authored-By: Claude Sonnet 5 <noreply@anthropic.com>
</commit_message>
<xml_diff>
--- a/resources/templates/PS1 Producer Statement.docx
+++ b/resources/templates/PS1 Producer Statement.docx
@@ -3960,7 +3960,7 @@
                 <w:sz w:val="16"/>
                 <w:szCs w:val="18"/>
               </w:rPr>
-              <w:t>1</w:t>
+              <w:t xml:space="preserve">{{inspection_subsurface_no}}</w:t>
             </w:r>
           </w:p>
         </w:tc>
@@ -4037,7 +4037,7 @@
                 <w:szCs w:val="18"/>
                 <w:lang w:val="en-US"/>
               </w:rPr>
-              <w:t>2</w:t>
+              <w:t xml:space="preserve">{{inspection_waffle_no}}</w:t>
             </w:r>
           </w:p>
         </w:tc>
@@ -4086,6 +4086,456 @@
                 <w:lang w:val="en-US"/>
               </w:rPr>
               <w:t>Pre-pour inspection.</w:t>
+            </w:r>
+          </w:p>
+        </w:tc>
+      </w:tr>
+      <w:tr>
+        <w:trPr>
+          <w:trHeight w:val="432"/>
+        </w:trPr>
+        <w:tc>
+          <w:tcPr>
+            <w:tcW w:w="625" w:type="dxa"/>
+            <w:shd w:val="clear" w:color="auto" w:fill="E7E6E6" w:themeFill="background2"/>
+          </w:tcPr>
+          <w:p>
+            <w:pPr>
+              <w:jc w:val="center"/>
+              <w:rPr>
+                <w:rFonts w:ascii="Verdana" w:hAnsi="Verdana"/>
+                <w:sz w:val="16"/>
+                <w:szCs w:val="18"/>
+              </w:rPr>
+            </w:pPr>
+            <w:r>
+              <w:rPr>
+                <w:rFonts w:ascii="Verdana" w:hAnsi="Verdana"/>
+                <w:sz w:val="16"/>
+                <w:szCs w:val="18"/>
+              </w:rPr>
+              <w:t xml:space="preserve">{{inspection_floor_diaphragm_no}}</w:t>
+            </w:r>
+          </w:p>
+        </w:tc>
+        <w:tc>
+          <w:tcPr>
+            <w:tcW w:w="3240" w:type="dxa"/>
+          </w:tcPr>
+          <w:p>
+            <w:pPr>
+              <w:rPr>
+                <w:rFonts w:ascii="Verdana" w:hAnsi="Verdana"/>
+                <w:sz w:val="16"/>
+                <w:szCs w:val="18"/>
+              </w:rPr>
+            </w:pPr>
+            <w:r>
+              <w:rPr>
+                <w:rFonts w:ascii="Verdana" w:hAnsi="Verdana"/>
+                <w:sz w:val="16"/>
+                <w:szCs w:val="18"/>
+              </w:rPr>
+              <w:t xml:space="preserve">Floor diaphragm</w:t>
+            </w:r>
+          </w:p>
+        </w:tc>
+        <w:tc>
+          <w:tcPr>
+            <w:tcW w:w="5151" w:type="dxa"/>
+          </w:tcPr>
+          <w:p>
+            <w:pPr>
+              <w:rPr>
+                <w:rFonts w:ascii="Verdana" w:hAnsi="Verdana"/>
+                <w:sz w:val="16"/>
+                <w:szCs w:val="18"/>
+                <w:lang w:val="en-US"/>
+              </w:rPr>
+            </w:pPr>
+            <w:r>
+              <w:rPr>
+                <w:rFonts w:ascii="Verdana" w:hAnsi="Verdana"/>
+                <w:sz w:val="16"/>
+                <w:szCs w:val="18"/>
+                <w:lang w:val="en-US"/>
+              </w:rPr>
+              <w:t xml:space="preserve">After erection and prior to installation of first floor framing.</w:t>
+            </w:r>
+          </w:p>
+        </w:tc>
+      </w:tr>
+      <w:tr>
+        <w:trPr>
+          <w:trHeight w:val="432"/>
+        </w:trPr>
+        <w:tc>
+          <w:tcPr>
+            <w:tcW w:w="625" w:type="dxa"/>
+            <w:shd w:val="clear" w:color="auto" w:fill="E7E6E6" w:themeFill="background2"/>
+          </w:tcPr>
+          <w:p>
+            <w:pPr>
+              <w:jc w:val="center"/>
+              <w:rPr>
+                <w:rFonts w:ascii="Verdana" w:hAnsi="Verdana"/>
+                <w:sz w:val="16"/>
+                <w:szCs w:val="18"/>
+              </w:rPr>
+            </w:pPr>
+            <w:r>
+              <w:rPr>
+                <w:rFonts w:ascii="Verdana" w:hAnsi="Verdana"/>
+                <w:sz w:val="16"/>
+                <w:szCs w:val="18"/>
+              </w:rPr>
+              <w:t xml:space="preserve">{{inspection_mid_floor_joist_no}}</w:t>
+            </w:r>
+          </w:p>
+        </w:tc>
+        <w:tc>
+          <w:tcPr>
+            <w:tcW w:w="3240" w:type="dxa"/>
+          </w:tcPr>
+          <w:p>
+            <w:pPr>
+              <w:rPr>
+                <w:rFonts w:ascii="Verdana" w:hAnsi="Verdana"/>
+                <w:sz w:val="16"/>
+                <w:szCs w:val="18"/>
+              </w:rPr>
+            </w:pPr>
+            <w:r>
+              <w:rPr>
+                <w:rFonts w:ascii="Verdana" w:hAnsi="Verdana"/>
+                <w:sz w:val="16"/>
+                <w:szCs w:val="18"/>
+              </w:rPr>
+              <w:t xml:space="preserve">Mid floor joist and all associated beams and lintels and steelwork.</w:t>
+            </w:r>
+          </w:p>
+        </w:tc>
+        <w:tc>
+          <w:tcPr>
+            <w:tcW w:w="5151" w:type="dxa"/>
+          </w:tcPr>
+          <w:p>
+            <w:pPr>
+              <w:rPr>
+                <w:rFonts w:ascii="Verdana" w:hAnsi="Verdana"/>
+                <w:sz w:val="16"/>
+                <w:szCs w:val="18"/>
+                <w:lang w:val="en-US"/>
+              </w:rPr>
+            </w:pPr>
+            <w:r>
+              <w:rPr>
+                <w:rFonts w:ascii="Verdana" w:hAnsi="Verdana"/>
+                <w:sz w:val="16"/>
+                <w:szCs w:val="18"/>
+                <w:lang w:val="en-US"/>
+              </w:rPr>
+              <w:t xml:space="preserve">Pre roof inspection. After erection and prior to lining/insulation/cladding.</w:t>
+            </w:r>
+          </w:p>
+        </w:tc>
+      </w:tr>
+      <w:tr>
+        <w:trPr>
+          <w:trHeight w:val="432"/>
+        </w:trPr>
+        <w:tc>
+          <w:tcPr>
+            <w:tcW w:w="625" w:type="dxa"/>
+            <w:shd w:val="clear" w:color="auto" w:fill="E7E6E6" w:themeFill="background2"/>
+          </w:tcPr>
+          <w:p>
+            <w:pPr>
+              <w:jc w:val="center"/>
+              <w:rPr>
+                <w:rFonts w:ascii="Verdana" w:hAnsi="Verdana"/>
+                <w:sz w:val="16"/>
+                <w:szCs w:val="18"/>
+              </w:rPr>
+            </w:pPr>
+            <w:r>
+              <w:rPr>
+                <w:rFonts w:ascii="Verdana" w:hAnsi="Verdana"/>
+                <w:sz w:val="16"/>
+                <w:szCs w:val="18"/>
+              </w:rPr>
+              <w:t xml:space="preserve">{{inspection_hold_down_brackets_no}}</w:t>
+            </w:r>
+          </w:p>
+        </w:tc>
+        <w:tc>
+          <w:tcPr>
+            <w:tcW w:w="3240" w:type="dxa"/>
+          </w:tcPr>
+          <w:p>
+            <w:pPr>
+              <w:rPr>
+                <w:rFonts w:ascii="Verdana" w:hAnsi="Verdana"/>
+                <w:sz w:val="16"/>
+                <w:szCs w:val="18"/>
+              </w:rPr>
+            </w:pPr>
+            <w:r>
+              <w:rPr>
+                <w:rFonts w:ascii="Verdana" w:hAnsi="Verdana"/>
+                <w:sz w:val="16"/>
+                <w:szCs w:val="18"/>
+              </w:rPr>
+              <w:t xml:space="preserve">Hold down brackets and bracing wall length to wall sheet bracing.</w:t>
+            </w:r>
+          </w:p>
+        </w:tc>
+        <w:tc>
+          <w:tcPr>
+            <w:tcW w:w="5151" w:type="dxa"/>
+          </w:tcPr>
+          <w:p>
+            <w:pPr>
+              <w:rPr>
+                <w:rFonts w:ascii="Verdana" w:hAnsi="Verdana"/>
+                <w:sz w:val="16"/>
+                <w:szCs w:val="18"/>
+                <w:lang w:val="en-US"/>
+              </w:rPr>
+            </w:pPr>
+            <w:r>
+              <w:rPr>
+                <w:rFonts w:ascii="Verdana" w:hAnsi="Verdana"/>
+                <w:sz w:val="16"/>
+                <w:szCs w:val="18"/>
+                <w:lang w:val="en-US"/>
+              </w:rPr>
+              <w:t xml:space="preserve">Pre-line inspection. After erection and prior to lining/insulation/cladding.</w:t>
+            </w:r>
+          </w:p>
+        </w:tc>
+      </w:tr>
+      <w:tr>
+        <w:trPr>
+          <w:trHeight w:val="432"/>
+        </w:trPr>
+        <w:tc>
+          <w:tcPr>
+            <w:tcW w:w="625" w:type="dxa"/>
+            <w:shd w:val="clear" w:color="auto" w:fill="E7E6E6" w:themeFill="background2"/>
+          </w:tcPr>
+          <w:p>
+            <w:pPr>
+              <w:jc w:val="center"/>
+              <w:rPr>
+                <w:rFonts w:ascii="Verdana" w:hAnsi="Verdana"/>
+                <w:sz w:val="16"/>
+                <w:szCs w:val="18"/>
+              </w:rPr>
+            </w:pPr>
+            <w:r>
+              <w:rPr>
+                <w:rFonts w:ascii="Verdana" w:hAnsi="Verdana"/>
+                <w:sz w:val="16"/>
+                <w:szCs w:val="18"/>
+              </w:rPr>
+              <w:t xml:space="preserve">{{inspection_ceiling_roof_strap_no}}</w:t>
+            </w:r>
+          </w:p>
+        </w:tc>
+        <w:tc>
+          <w:tcPr>
+            <w:tcW w:w="3240" w:type="dxa"/>
+          </w:tcPr>
+          <w:p>
+            <w:pPr>
+              <w:rPr>
+                <w:rFonts w:ascii="Verdana" w:hAnsi="Verdana"/>
+                <w:sz w:val="16"/>
+                <w:szCs w:val="18"/>
+              </w:rPr>
+            </w:pPr>
+            <w:r>
+              <w:rPr>
+                <w:rFonts w:ascii="Verdana" w:hAnsi="Verdana"/>
+                <w:sz w:val="16"/>
+                <w:szCs w:val="18"/>
+              </w:rPr>
+              <w:t xml:space="preserve">Ceiling/roof strap braces</w:t>
+            </w:r>
+          </w:p>
+        </w:tc>
+        <w:tc>
+          <w:tcPr>
+            <w:tcW w:w="5151" w:type="dxa"/>
+          </w:tcPr>
+          <w:p>
+            <w:pPr>
+              <w:rPr>
+                <w:rFonts w:ascii="Verdana" w:hAnsi="Verdana"/>
+                <w:sz w:val="16"/>
+                <w:szCs w:val="18"/>
+                <w:lang w:val="en-US"/>
+              </w:rPr>
+            </w:pPr>
+            <w:r>
+              <w:rPr>
+                <w:rFonts w:ascii="Verdana" w:hAnsi="Verdana"/>
+                <w:sz w:val="16"/>
+                <w:szCs w:val="18"/>
+                <w:lang w:val="en-US"/>
+              </w:rPr>
+              <w:t xml:space="preserve">Pre-line inspection. After erection and prior to lining/insulation/cladding.</w:t>
+            </w:r>
+          </w:p>
+        </w:tc>
+      </w:tr>
+      <w:tr>
+        <w:trPr>
+          <w:trHeight w:val="432"/>
+        </w:trPr>
+        <w:tc>
+          <w:tcPr>
+            <w:tcW w:w="625" w:type="dxa"/>
+            <w:shd w:val="clear" w:color="auto" w:fill="E7E6E6" w:themeFill="background2"/>
+          </w:tcPr>
+          <w:p>
+            <w:pPr>
+              <w:jc w:val="center"/>
+              <w:rPr>
+                <w:rFonts w:ascii="Verdana" w:hAnsi="Verdana"/>
+                <w:sz w:val="16"/>
+                <w:szCs w:val="18"/>
+              </w:rPr>
+            </w:pPr>
+            <w:r>
+              <w:rPr>
+                <w:rFonts w:ascii="Verdana" w:hAnsi="Verdana"/>
+                <w:sz w:val="16"/>
+                <w:szCs w:val="18"/>
+              </w:rPr>
+              <w:t xml:space="preserve">{{inspection_wall_lining_no}}</w:t>
+            </w:r>
+          </w:p>
+        </w:tc>
+        <w:tc>
+          <w:tcPr>
+            <w:tcW w:w="3240" w:type="dxa"/>
+          </w:tcPr>
+          <w:p>
+            <w:pPr>
+              <w:rPr>
+                <w:rFonts w:ascii="Verdana" w:hAnsi="Verdana"/>
+                <w:sz w:val="16"/>
+                <w:szCs w:val="18"/>
+              </w:rPr>
+            </w:pPr>
+            <w:r>
+              <w:rPr>
+                <w:rFonts w:ascii="Verdana" w:hAnsi="Verdana"/>
+                <w:sz w:val="16"/>
+                <w:szCs w:val="18"/>
+              </w:rPr>
+              <w:t xml:space="preserve">Wall lining and associated fixing schedule.</w:t>
+            </w:r>
+          </w:p>
+        </w:tc>
+        <w:tc>
+          <w:tcPr>
+            <w:tcW w:w="5151" w:type="dxa"/>
+          </w:tcPr>
+          <w:p>
+            <w:pPr>
+              <w:rPr>
+                <w:rFonts w:ascii="Verdana" w:hAnsi="Verdana"/>
+                <w:sz w:val="16"/>
+                <w:szCs w:val="18"/>
+                <w:lang w:val="en-US"/>
+              </w:rPr>
+            </w:pPr>
+            <w:r>
+              <w:rPr>
+                <w:rFonts w:ascii="Verdana" w:hAnsi="Verdana"/>
+                <w:sz w:val="16"/>
+                <w:szCs w:val="18"/>
+                <w:lang w:val="en-US"/>
+              </w:rPr>
+              <w:t xml:space="preserve">Post line inspection. After lining and prior to stop</w:t>
+            </w:r>
+          </w:p>
+        </w:tc>
+      </w:tr>
+      <w:tr>
+        <w:trPr>
+          <w:trHeight w:val="432"/>
+        </w:trPr>
+        <w:tc>
+          <w:tcPr>
+            <w:tcW w:w="625" w:type="dxa"/>
+            <w:shd w:val="clear" w:color="auto" w:fill="E7E6E6" w:themeFill="background2"/>
+          </w:tcPr>
+          <w:p>
+            <w:pPr>
+              <w:jc w:val="center"/>
+              <w:rPr>
+                <w:rFonts w:ascii="Verdana" w:hAnsi="Verdana"/>
+                <w:sz w:val="16"/>
+                <w:szCs w:val="18"/>
+              </w:rPr>
+            </w:pPr>
+            <w:r>
+              <w:rPr>
+                <w:rFonts w:ascii="Verdana" w:hAnsi="Verdana"/>
+                <w:sz w:val="16"/>
+                <w:szCs w:val="18"/>
+              </w:rPr>
+              <w:t xml:space="preserve">{{inspection_other_no}}</w:t>
+            </w:r>
+          </w:p>
+        </w:tc>
+        <w:tc>
+          <w:tcPr>
+            <w:tcW w:w="3240" w:type="dxa"/>
+          </w:tcPr>
+          <w:p>
+            <w:pPr>
+              <w:rPr>
+                <w:rFonts w:ascii="Verdana" w:hAnsi="Verdana"/>
+                <w:sz w:val="16"/>
+                <w:szCs w:val="18"/>
+              </w:rPr>
+            </w:pPr>
+            <w:r>
+              <w:rPr>
+                <w:rFonts w:ascii="Verdana" w:hAnsi="Verdana"/>
+                <w:sz w:val="16"/>
+                <w:szCs w:val="18"/>
+              </w:rPr>
+              <w:t xml:space="preserve">{{inspection_other_description}}</w:t>
+            </w:r>
+          </w:p>
+        </w:tc>
+        <w:tc>
+          <w:tcPr>
+            <w:tcW w:w="5151" w:type="dxa"/>
+          </w:tcPr>
+          <w:p>
+            <w:pPr>
+              <w:rPr>
+                <w:rFonts w:ascii="Verdana" w:hAnsi="Verdana"/>
+                <w:sz w:val="16"/>
+                <w:szCs w:val="18"/>
+                <w:lang w:val="en-US"/>
+              </w:rPr>
+            </w:pPr>
+            <w:r>
+              <w:rPr>
+                <w:rFonts w:ascii="Verdana" w:hAnsi="Verdana"/>
+                <w:sz w:val="16"/>
+                <w:szCs w:val="18"/>
+                <w:lang w:val="en-US"/>
+              </w:rPr>
+              <w:t xml:space="preserve">{{inspection_other_time_frame}}</w:t>
             </w:r>
           </w:p>
         </w:tc>

</xml_diff>